<commit_message>
Fix SSH client compatibility instructions
</commit_message>
<xml_diff>
--- a/labs/02-secure-ssh-management/CCNP_ENCOR_Secure_SSH_Management_KB.docx
+++ b/labs/02-secure-ssh-management/CCNP_ENCOR_Secure_SSH_Management_KB.docx
@@ -872,12 +872,12 @@
         <w:pStyle w:val="Heading2"/>
       </w:pPr>
       <w:r>
-        <w:t>7.2 Older IOS host-key compatibility</w:t>
+        <w:t>7.2 Older IOS client-algorithm compatibility</w:t>
       </w:r>
     </w:p>
     <w:p>
       <w:r>
-        <w:t>If the lab client rejects the IOS host-key algorithm, use the compatibility option provided in the supplied lab notes:</w:t>
+        <w:t>Modern OpenSSH clients disable the SHA-1 key-exchange and RSA host-key algorithms offered by this older IOS image. If the client reports no matching key exchange method or host key type, use both compatibility options:</w:t>
       </w:r>
     </w:p>
     <w:p>
@@ -886,7 +886,7 @@
         <w:keepLines/>
       </w:pPr>
       <w:r>
-        <w:t>ssh -o HostKeyAlgorithms=+ssh-rsa netadmin@192.168.10.1</w:t>
+        <w:t>ssh -o KexAlgorithms=+diffie-hellman-group14-sha1 -o HostKeyAlgorithms=+ssh-rsa netadmin@192.168.10.1</w:t>
       </w:r>
     </w:p>
     <w:p>
@@ -1359,7 +1359,7 @@
               <w:spacing w:after="0"/>
             </w:pPr>
             <w:r>
-              <w:t>SSH client rejects host key</w:t>
+              <w:t>SSH client rejects key exchange or host key</w:t>
             </w:r>
           </w:p>
         </w:tc>
@@ -1379,7 +1379,7 @@
               <w:spacing w:after="0"/>
             </w:pPr>
             <w:r>
-              <w:t>Client algorithm policy and older IOS key algorithm differ</w:t>
+              <w:t>Modern client disables older IOS SHA-1/RSA algorithms</w:t>
             </w:r>
           </w:p>
         </w:tc>
@@ -1399,7 +1399,7 @@
               <w:spacing w:after="0"/>
             </w:pPr>
             <w:r>
-              <w:t>Use the supplied HostKeyAlgorithms compatibility option for this lab</w:t>
+              <w:t>Use both compatibility options shown in section 7.2</w:t>
             </w:r>
           </w:p>
         </w:tc>
@@ -1731,6 +1731,8 @@
         <w:t>show running-config | section line vty</w:t>
         <w:br/>
         <w:t>ssh netadmin@192.168.10.1</w:t>
+        <w:br/>
+        <w:t>ssh -o KexAlgorithms=+diffie-hellman-group14-sha1 -o HostKeyAlgorithms=+ssh-rsa netadmin@192.168.10.1</w:t>
         <w:br/>
         <w:t>nc -vz 192.168.10.1 23</w:t>
         <w:br/>

</xml_diff>

<commit_message>
Correct SSH setup command order
</commit_message>
<xml_diff>
--- a/labs/02-secure-ssh-management/CCNP_ENCOR_Secure_SSH_Management_KB.docx
+++ b/labs/02-secure-ssh-management/CCNP_ENCOR_Secure_SSH_Management_KB.docx
@@ -683,9 +683,9 @@
         <w:br/>
         <w:t>username netadmin privilege 15 secret CcnpLab2026!</w:t>
         <w:br/>
+        <w:t>crypto key generate rsa general-keys modulus 2048</w:t>
+        <w:br/>
         <w:t>ip ssh version 2</w:t>
-        <w:br/>
-        <w:t>crypto key generate rsa general-keys modulus 2048</w:t>
         <w:br/>
         <w:t>line vty 0 4</w:t>
         <w:br/>

</xml_diff>